<commit_message>
feat: append variant descriptors to gift titles for claims board clarity
</commit_message>
<xml_diff>
--- a/מקרא-מתנות.docx
+++ b/מקרא-מתנות.docx
@@ -4,53 +4,48 @@
   <w:body>
     <w:p>
       <w:pPr>
-        <w:bidi/>
-        <w:spacing w:after="240"/>
+        <w:pStyle w:val="Heading1"/>
         <w:jc w:val="center"/>
       </w:pPr>
       <w:r>
         <w:rPr>
-          <w:rFonts w:ascii="Arial" w:cs="Arial" w:eastAsia="Arial" w:hAnsi="Arial"/>
           <w:b/>
           <w:bCs/>
-          <w:sz w:val="36"/>
-          <w:szCs w:val="36"/>
         </w:rPr>
         <w:t xml:space="preserve">מקרא מתנות</w:t>
       </w:r>
     </w:p>
     <w:tbl>
       <w:tblPr>
-        <w:tblW w:type="dxa" w:w="10206"/>
+        <w:tblW w:type="dxa" w:w="9000"/>
         <w:tblBorders>
-          <w:top w:val="single" w:color="D9D9D9" w:sz="2"/>
-          <w:left w:val="single" w:color="D9D9D9" w:sz="2"/>
-          <w:bottom w:val="single" w:color="D9D9D9" w:sz="2"/>
-          <w:right w:val="single" w:color="D9D9D9" w:sz="2"/>
+          <w:top w:val="single" w:color="auto" w:sz="4"/>
+          <w:left w:val="single" w:color="auto" w:sz="4"/>
+          <w:bottom w:val="single" w:color="auto" w:sz="4"/>
+          <w:right w:val="single" w:color="auto" w:sz="4"/>
           <w:insideH w:val="single" w:color="auto" w:sz="4"/>
           <w:insideV w:val="single" w:color="auto" w:sz="4"/>
         </w:tblBorders>
       </w:tblPr>
       <w:tblGrid>
-        <w:gridCol w:w="3402"/>
-        <w:gridCol w:w="3402"/>
-        <w:gridCol w:w="3402"/>
+        <w:gridCol w:w="3000"/>
+        <w:gridCol w:w="3000"/>
+        <w:gridCol w:w="3000"/>
       </w:tblGrid>
       <w:tr>
         <w:tc>
           <w:tcPr>
-            <w:tcW w:type="dxa" w:w="3402"/>
-            <w:tcBorders>
-              <w:top w:val="single" w:color="D9D9D9" w:sz="2"/>
-              <w:left w:val="single" w:color="D9D9D9" w:sz="2"/>
-              <w:bottom w:val="single" w:color="D9D9D9" w:sz="2"/>
-              <w:right w:val="single" w:color="D9D9D9" w:sz="2"/>
-            </w:tcBorders>
+            <w:tcW w:type="dxa" w:w="3000"/>
+            <w:tcMar>
+              <w:top w:type="dxa" w:w="100"/>
+              <w:left w:type="dxa" w:w="100"/>
+              <w:bottom w:type="dxa" w:w="100"/>
+              <w:right w:type="dxa" w:w="100"/>
+            </w:tcMar>
             <w:vAlign w:val="center"/>
           </w:tcPr>
           <w:p>
             <w:pPr>
-              <w:spacing w:after="80" w:before="120"/>
               <w:jc w:val="center"/>
             </w:pPr>
             <w:r>
@@ -96,151 +91,46 @@
           </w:p>
           <w:p>
             <w:pPr>
-              <w:bidi/>
-              <w:spacing w:after="20"/>
               <w:jc w:val="center"/>
             </w:pPr>
             <w:r>
               <w:rPr>
-                <w:rFonts w:ascii="Arial" w:cs="Arial" w:eastAsia="Arial" w:hAnsi="Arial"/>
                 <w:b/>
                 <w:bCs/>
-                <w:sz w:val="20"/>
-                <w:szCs w:val="20"/>
               </w:rPr>
               <w:t xml:space="preserve">כוס תרמוס עם קש</w:t>
             </w:r>
           </w:p>
           <w:p>
             <w:pPr>
-              <w:bidi/>
-              <w:spacing w:after="120"/>
-              <w:jc w:val="center"/>
-            </w:pPr>
-            <w:r>
-              <w:rPr>
-                <w:rFonts w:ascii="Arial" w:cs="Arial" w:eastAsia="Arial" w:hAnsi="Arial"/>
-                <w:color w:val="595959"/>
-                <w:sz w:val="18"/>
-                <w:szCs w:val="18"/>
-              </w:rPr>
+              <w:jc w:val="center"/>
+            </w:pPr>
+            <w:r>
               <w:t xml:space="preserve">לבן 900 מ"ל</w:t>
             </w:r>
           </w:p>
         </w:tc>
         <w:tc>
           <w:tcPr>
-            <w:tcW w:type="dxa" w:w="3402"/>
-            <w:tcBorders>
-              <w:top w:val="single" w:color="D9D9D9" w:sz="2"/>
-              <w:left w:val="single" w:color="D9D9D9" w:sz="2"/>
-              <w:bottom w:val="single" w:color="D9D9D9" w:sz="2"/>
-              <w:right w:val="single" w:color="D9D9D9" w:sz="2"/>
-            </w:tcBorders>
+            <w:tcW w:type="dxa" w:w="3000"/>
+            <w:tcMar>
+              <w:top w:type="dxa" w:w="100"/>
+              <w:left w:type="dxa" w:w="100"/>
+              <w:bottom w:type="dxa" w:w="100"/>
+              <w:right w:type="dxa" w:w="100"/>
+            </w:tcMar>
             <w:vAlign w:val="center"/>
           </w:tcPr>
           <w:p>
             <w:pPr>
-              <w:spacing w:after="80" w:before="120"/>
               <w:jc w:val="center"/>
             </w:pPr>
             <w:r>
               <w:drawing>
                 <wp:inline distT="0" distB="0" distL="0" distR="0">
-                  <wp:extent cx="857250" cy="1143000"/>
+                  <wp:extent cx="809625" cy="1143000"/>
                   <wp:effectExtent t="0" r="0" b="0" l="0"/>
                   <wp:docPr id="2" name="" descr="" title=""/>
-                  <wp:cNvGraphicFramePr>
-                    <a:graphicFrameLocks xmlns:a="http://schemas.openxmlformats.org/drawingml/2006/main" noChangeAspect="1"/>
-                  </wp:cNvGraphicFramePr>
-                  <a:graphic xmlns:a="http://schemas.openxmlformats.org/drawingml/2006/main">
-                    <a:graphicData uri="http://schemas.openxmlformats.org/drawingml/2006/picture">
-                      <pic:pic xmlns:pic="http://schemas.openxmlformats.org/drawingml/2006/picture">
-                        <pic:nvPicPr>
-                          <pic:cNvPr id="0" name="" descr=""/>
-                          <pic:cNvPicPr>
-                            <a:picLocks noChangeAspect="1" noChangeArrowheads="1"/>
-                          </pic:cNvPicPr>
-                        </pic:nvPicPr>
-                        <pic:blipFill>
-                          <a:blip r:embed="rId7" cstate="none"/>
-                          <a:srcRect/>
-                          <a:stretch>
-                            <a:fillRect/>
-                          </a:stretch>
-                        </pic:blipFill>
-                        <pic:spPr bwMode="auto">
-                          <a:xfrm>
-                            <a:off x="0" y="0"/>
-                            <a:ext cx="857250" cy="1143000"/>
-                          </a:xfrm>
-                          <a:prstGeom prst="rect">
-                            <a:avLst/>
-                          </a:prstGeom>
-                        </pic:spPr>
-                      </pic:pic>
-                    </a:graphicData>
-                  </a:graphic>
-                </wp:inline>
-              </w:drawing>
-            </w:r>
-          </w:p>
-          <w:p>
-            <w:pPr>
-              <w:bidi/>
-              <w:spacing w:after="20"/>
-              <w:jc w:val="center"/>
-            </w:pPr>
-            <w:r>
-              <w:rPr>
-                <w:rFonts w:ascii="Arial" w:cs="Arial" w:eastAsia="Arial" w:hAnsi="Arial"/>
-                <w:b/>
-                <w:bCs/>
-                <w:sz w:val="20"/>
-                <w:szCs w:val="20"/>
-              </w:rPr>
-              <w:t xml:space="preserve">כוס תרמוס עם קש</w:t>
-            </w:r>
-          </w:p>
-          <w:p>
-            <w:pPr>
-              <w:bidi/>
-              <w:spacing w:after="120"/>
-              <w:jc w:val="center"/>
-            </w:pPr>
-            <w:r>
-              <w:rPr>
-                <w:rFonts w:ascii="Arial" w:cs="Arial" w:eastAsia="Arial" w:hAnsi="Arial"/>
-                <w:color w:val="595959"/>
-                <w:sz w:val="18"/>
-                <w:szCs w:val="18"/>
-              </w:rPr>
-              <w:t xml:space="preserve">לבן 700 מ"ל</w:t>
-            </w:r>
-          </w:p>
-        </w:tc>
-        <w:tc>
-          <w:tcPr>
-            <w:tcW w:type="dxa" w:w="3402"/>
-            <w:tcBorders>
-              <w:top w:val="single" w:color="D9D9D9" w:sz="2"/>
-              <w:left w:val="single" w:color="D9D9D9" w:sz="2"/>
-              <w:bottom w:val="single" w:color="D9D9D9" w:sz="2"/>
-              <w:right w:val="single" w:color="D9D9D9" w:sz="2"/>
-            </w:tcBorders>
-            <w:vAlign w:val="center"/>
-          </w:tcPr>
-          <w:p>
-            <w:pPr>
-              <w:spacing w:after="80" w:before="120"/>
-              <w:jc w:val="center"/>
-            </w:pPr>
-            <w:r>
-              <w:drawing>
-                <wp:inline distT="0" distB="0" distL="0" distR="0">
-                  <wp:extent cx="857250" cy="1143000"/>
-                  <wp:effectExtent t="0" r="0" b="0" l="0"/>
-                  <wp:docPr id="3" name="" descr="" title=""/>
                   <wp:cNvGraphicFramePr>
                     <a:graphicFrameLocks xmlns:a="http://schemas.openxmlformats.org/drawingml/2006/main" noChangeAspect="1"/>
                   </wp:cNvGraphicFramePr>
@@ -263,7 +153,7 @@
                         <pic:spPr bwMode="auto">
                           <a:xfrm>
                             <a:off x="0" y="0"/>
-                            <a:ext cx="857250" cy="1143000"/>
+                            <a:ext cx="809625" cy="1143000"/>
                           </a:xfrm>
                           <a:prstGeom prst="rect">
                             <a:avLst/>
@@ -278,62 +168,46 @@
           </w:p>
           <w:p>
             <w:pPr>
-              <w:bidi/>
-              <w:spacing w:after="20"/>
               <w:jc w:val="center"/>
             </w:pPr>
             <w:r>
               <w:rPr>
-                <w:rFonts w:ascii="Arial" w:cs="Arial" w:eastAsia="Arial" w:hAnsi="Arial"/>
                 <w:b/>
                 <w:bCs/>
-                <w:sz w:val="20"/>
-                <w:szCs w:val="20"/>
               </w:rPr>
               <w:t xml:space="preserve">כוס תרמוס עם קש</w:t>
             </w:r>
           </w:p>
           <w:p>
             <w:pPr>
-              <w:bidi/>
-              <w:spacing w:after="120"/>
-              <w:jc w:val="center"/>
-            </w:pPr>
-            <w:r>
-              <w:rPr>
-                <w:rFonts w:ascii="Arial" w:cs="Arial" w:eastAsia="Arial" w:hAnsi="Arial"/>
-                <w:color w:val="595959"/>
-                <w:sz w:val="18"/>
-                <w:szCs w:val="18"/>
-              </w:rPr>
-              <w:t xml:space="preserve">שחור</w:t>
+              <w:jc w:val="center"/>
+            </w:pPr>
+            <w:r>
+              <w:t xml:space="preserve">לבן 700 מל</w:t>
             </w:r>
           </w:p>
         </w:tc>
-      </w:tr>
-      <w:tr>
         <w:tc>
           <w:tcPr>
-            <w:tcW w:type="dxa" w:w="3402"/>
-            <w:tcBorders>
-              <w:top w:val="single" w:color="D9D9D9" w:sz="2"/>
-              <w:left w:val="single" w:color="D9D9D9" w:sz="2"/>
-              <w:bottom w:val="single" w:color="D9D9D9" w:sz="2"/>
-              <w:right w:val="single" w:color="D9D9D9" w:sz="2"/>
-            </w:tcBorders>
+            <w:tcW w:type="dxa" w:w="3000"/>
+            <w:tcMar>
+              <w:top w:type="dxa" w:w="100"/>
+              <w:left w:type="dxa" w:w="100"/>
+              <w:bottom w:type="dxa" w:w="100"/>
+              <w:right w:type="dxa" w:w="100"/>
+            </w:tcMar>
             <w:vAlign w:val="center"/>
           </w:tcPr>
           <w:p>
             <w:pPr>
-              <w:spacing w:after="80" w:before="120"/>
               <w:jc w:val="center"/>
             </w:pPr>
             <w:r>
               <w:drawing>
                 <wp:inline distT="0" distB="0" distL="0" distR="0">
-                  <wp:extent cx="1143000" cy="533400"/>
+                  <wp:extent cx="857250" cy="1143000"/>
                   <wp:effectExtent t="0" r="0" b="0" l="0"/>
-                  <wp:docPr id="4" name="" descr="" title=""/>
+                  <wp:docPr id="3" name="" descr="" title=""/>
                   <wp:cNvGraphicFramePr>
                     <a:graphicFrameLocks xmlns:a="http://schemas.openxmlformats.org/drawingml/2006/main" noChangeAspect="1"/>
                   </wp:cNvGraphicFramePr>
@@ -356,7 +230,7 @@
                         <pic:spPr bwMode="auto">
                           <a:xfrm>
                             <a:off x="0" y="0"/>
-                            <a:ext cx="1143000" cy="533400"/>
+                            <a:ext cx="857250" cy="1143000"/>
                           </a:xfrm>
                           <a:prstGeom prst="rect">
                             <a:avLst/>
@@ -371,60 +245,48 @@
           </w:p>
           <w:p>
             <w:pPr>
-              <w:bidi/>
-              <w:spacing w:after="20"/>
               <w:jc w:val="center"/>
             </w:pPr>
             <w:r>
               <w:rPr>
-                <w:rFonts w:ascii="Arial" w:cs="Arial" w:eastAsia="Arial" w:hAnsi="Arial"/>
                 <w:b/>
                 <w:bCs/>
-                <w:sz w:val="20"/>
-                <w:szCs w:val="20"/>
               </w:rPr>
-              <w:t xml:space="preserve">מגש פינוק למחשב נייד / טאבלט</w:t>
-            </w:r>
-          </w:p>
-          <w:p>
-            <w:pPr>
-              <w:bidi/>
-              <w:spacing w:after="120"/>
-              <w:jc w:val="center"/>
-            </w:pPr>
-            <w:r>
-              <w:rPr>
-                <w:rFonts w:ascii="Arial" w:cs="Arial" w:eastAsia="Arial" w:hAnsi="Arial"/>
-                <w:color w:val="595959"/>
-                <w:sz w:val="18"/>
-                <w:szCs w:val="18"/>
-              </w:rPr>
-              <w:t xml:space="preserve">רגיל</w:t>
+              <w:t xml:space="preserve">כוס תרמוס עם קש</w:t>
+            </w:r>
+          </w:p>
+          <w:p>
+            <w:pPr>
+              <w:jc w:val="center"/>
+            </w:pPr>
+            <w:r>
+              <w:t xml:space="preserve">שחור</w:t>
             </w:r>
           </w:p>
         </w:tc>
+      </w:tr>
+      <w:tr>
         <w:tc>
           <w:tcPr>
-            <w:tcW w:type="dxa" w:w="3402"/>
-            <w:tcBorders>
-              <w:top w:val="single" w:color="D9D9D9" w:sz="2"/>
-              <w:left w:val="single" w:color="D9D9D9" w:sz="2"/>
-              <w:bottom w:val="single" w:color="D9D9D9" w:sz="2"/>
-              <w:right w:val="single" w:color="D9D9D9" w:sz="2"/>
-            </w:tcBorders>
+            <w:tcW w:type="dxa" w:w="3000"/>
+            <w:tcMar>
+              <w:top w:type="dxa" w:w="100"/>
+              <w:left w:type="dxa" w:w="100"/>
+              <w:bottom w:type="dxa" w:w="100"/>
+              <w:right w:type="dxa" w:w="100"/>
+            </w:tcMar>
             <w:vAlign w:val="center"/>
           </w:tcPr>
           <w:p>
             <w:pPr>
-              <w:spacing w:after="80" w:before="120"/>
               <w:jc w:val="center"/>
             </w:pPr>
             <w:r>
               <w:drawing>
                 <wp:inline distT="0" distB="0" distL="0" distR="0">
-                  <wp:extent cx="1143000" cy="1095375"/>
+                  <wp:extent cx="1143000" cy="533400"/>
                   <wp:effectExtent t="0" r="0" b="0" l="0"/>
-                  <wp:docPr id="5" name="" descr="" title=""/>
+                  <wp:docPr id="4" name="" descr="" title=""/>
                   <wp:cNvGraphicFramePr>
                     <a:graphicFrameLocks xmlns:a="http://schemas.openxmlformats.org/drawingml/2006/main" noChangeAspect="1"/>
                   </wp:cNvGraphicFramePr>
@@ -447,7 +309,7 @@
                         <pic:spPr bwMode="auto">
                           <a:xfrm>
                             <a:off x="0" y="0"/>
-                            <a:ext cx="1143000" cy="1095375"/>
+                            <a:ext cx="1143000" cy="533400"/>
                           </a:xfrm>
                           <a:prstGeom prst="rect">
                             <a:avLst/>
@@ -462,44 +324,46 @@
           </w:p>
           <w:p>
             <w:pPr>
-              <w:bidi/>
-              <w:spacing w:after="120"/>
               <w:jc w:val="center"/>
             </w:pPr>
             <w:r>
               <w:rPr>
-                <w:rFonts w:ascii="Arial" w:cs="Arial" w:eastAsia="Arial" w:hAnsi="Arial"/>
                 <w:b/>
                 <w:bCs/>
-                <w:sz w:val="20"/>
-                <w:szCs w:val="20"/>
               </w:rPr>
-              <w:t xml:space="preserve">מעמד מחשב</w:t>
+              <w:t xml:space="preserve">מגש פינוק למחשב נייד / טאבלט</w:t>
+            </w:r>
+          </w:p>
+          <w:p>
+            <w:pPr>
+              <w:jc w:val="center"/>
+            </w:pPr>
+            <w:r>
+              <w:t xml:space="preserve">רגיל</w:t>
             </w:r>
           </w:p>
         </w:tc>
         <w:tc>
           <w:tcPr>
-            <w:tcW w:type="dxa" w:w="3402"/>
-            <w:tcBorders>
-              <w:top w:val="single" w:color="D9D9D9" w:sz="2"/>
-              <w:left w:val="single" w:color="D9D9D9" w:sz="2"/>
-              <w:bottom w:val="single" w:color="D9D9D9" w:sz="2"/>
-              <w:right w:val="single" w:color="D9D9D9" w:sz="2"/>
-            </w:tcBorders>
+            <w:tcW w:type="dxa" w:w="3000"/>
+            <w:tcMar>
+              <w:top w:type="dxa" w:w="100"/>
+              <w:left w:type="dxa" w:w="100"/>
+              <w:bottom w:type="dxa" w:w="100"/>
+              <w:right w:type="dxa" w:w="100"/>
+            </w:tcMar>
             <w:vAlign w:val="center"/>
           </w:tcPr>
           <w:p>
             <w:pPr>
-              <w:spacing w:after="80" w:before="120"/>
               <w:jc w:val="center"/>
             </w:pPr>
             <w:r>
               <w:drawing>
                 <wp:inline distT="0" distB="0" distL="0" distR="0">
-                  <wp:extent cx="857250" cy="1143000"/>
+                  <wp:extent cx="1143000" cy="1095375"/>
                   <wp:effectExtent t="0" r="0" b="0" l="0"/>
-                  <wp:docPr id="6" name="" descr="" title=""/>
+                  <wp:docPr id="5" name="" descr="" title=""/>
                   <wp:cNvGraphicFramePr>
                     <a:graphicFrameLocks xmlns:a="http://schemas.openxmlformats.org/drawingml/2006/main" noChangeAspect="1"/>
                   </wp:cNvGraphicFramePr>
@@ -522,7 +386,7 @@
                         <pic:spPr bwMode="auto">
                           <a:xfrm>
                             <a:off x="0" y="0"/>
-                            <a:ext cx="857250" cy="1143000"/>
+                            <a:ext cx="1143000" cy="1095375"/>
                           </a:xfrm>
                           <a:prstGeom prst="rect">
                             <a:avLst/>
@@ -537,62 +401,38 @@
           </w:p>
           <w:p>
             <w:pPr>
-              <w:bidi/>
-              <w:spacing w:after="20"/>
               <w:jc w:val="center"/>
             </w:pPr>
             <w:r>
               <w:rPr>
-                <w:rFonts w:ascii="Arial" w:cs="Arial" w:eastAsia="Arial" w:hAnsi="Arial"/>
                 <w:b/>
                 <w:bCs/>
-                <w:sz w:val="20"/>
-                <w:szCs w:val="20"/>
               </w:rPr>
-              <w:t xml:space="preserve">צידנית 8 ליטר</w:t>
-            </w:r>
-          </w:p>
-          <w:p>
-            <w:pPr>
-              <w:bidi/>
-              <w:spacing w:after="120"/>
-              <w:jc w:val="center"/>
-            </w:pPr>
-            <w:r>
-              <w:rPr>
-                <w:rFonts w:ascii="Arial" w:cs="Arial" w:eastAsia="Arial" w:hAnsi="Arial"/>
-                <w:color w:val="595959"/>
-                <w:sz w:val="18"/>
-                <w:szCs w:val="18"/>
-              </w:rPr>
-              <w:t xml:space="preserve">אפור</w:t>
+              <w:t xml:space="preserve">מעמד מחשב</w:t>
             </w:r>
           </w:p>
         </w:tc>
-      </w:tr>
-      <w:tr>
         <w:tc>
           <w:tcPr>
-            <w:tcW w:type="dxa" w:w="3402"/>
-            <w:tcBorders>
-              <w:top w:val="single" w:color="D9D9D9" w:sz="2"/>
-              <w:left w:val="single" w:color="D9D9D9" w:sz="2"/>
-              <w:bottom w:val="single" w:color="D9D9D9" w:sz="2"/>
-              <w:right w:val="single" w:color="D9D9D9" w:sz="2"/>
-            </w:tcBorders>
+            <w:tcW w:type="dxa" w:w="3000"/>
+            <w:tcMar>
+              <w:top w:type="dxa" w:w="100"/>
+              <w:left w:type="dxa" w:w="100"/>
+              <w:bottom w:type="dxa" w:w="100"/>
+              <w:right w:type="dxa" w:w="100"/>
+            </w:tcMar>
             <w:vAlign w:val="center"/>
           </w:tcPr>
           <w:p>
             <w:pPr>
-              <w:spacing w:after="80" w:before="120"/>
               <w:jc w:val="center"/>
             </w:pPr>
             <w:r>
               <w:drawing>
                 <wp:inline distT="0" distB="0" distL="0" distR="0">
-                  <wp:extent cx="1143000" cy="1123950"/>
+                  <wp:extent cx="857250" cy="1143000"/>
                   <wp:effectExtent t="0" r="0" b="0" l="0"/>
-                  <wp:docPr id="7" name="" descr="" title=""/>
+                  <wp:docPr id="6" name="" descr="" title=""/>
                   <wp:cNvGraphicFramePr>
                     <a:graphicFrameLocks xmlns:a="http://schemas.openxmlformats.org/drawingml/2006/main" noChangeAspect="1"/>
                   </wp:cNvGraphicFramePr>
@@ -615,7 +455,7 @@
                         <pic:spPr bwMode="auto">
                           <a:xfrm>
                             <a:off x="0" y="0"/>
-                            <a:ext cx="1143000" cy="1123950"/>
+                            <a:ext cx="857250" cy="1143000"/>
                           </a:xfrm>
                           <a:prstGeom prst="rect">
                             <a:avLst/>
@@ -630,60 +470,48 @@
           </w:p>
           <w:p>
             <w:pPr>
-              <w:bidi/>
-              <w:spacing w:after="20"/>
               <w:jc w:val="center"/>
             </w:pPr>
             <w:r>
               <w:rPr>
-                <w:rFonts w:ascii="Arial" w:cs="Arial" w:eastAsia="Arial" w:hAnsi="Arial"/>
                 <w:b/>
                 <w:bCs/>
-                <w:sz w:val="20"/>
-                <w:szCs w:val="20"/>
               </w:rPr>
-              <w:t xml:space="preserve">צידנית אישית</w:t>
-            </w:r>
-          </w:p>
-          <w:p>
-            <w:pPr>
-              <w:bidi/>
-              <w:spacing w:after="120"/>
-              <w:jc w:val="center"/>
-            </w:pPr>
-            <w:r>
-              <w:rPr>
-                <w:rFonts w:ascii="Arial" w:cs="Arial" w:eastAsia="Arial" w:hAnsi="Arial"/>
-                <w:color w:val="595959"/>
-                <w:sz w:val="18"/>
-                <w:szCs w:val="18"/>
-              </w:rPr>
+              <w:t xml:space="preserve">צידנית 8 ליטר</w:t>
+            </w:r>
+          </w:p>
+          <w:p>
+            <w:pPr>
+              <w:jc w:val="center"/>
+            </w:pPr>
+            <w:r>
               <w:t xml:space="preserve">אפור</w:t>
             </w:r>
           </w:p>
         </w:tc>
+      </w:tr>
+      <w:tr>
         <w:tc>
           <w:tcPr>
-            <w:tcW w:type="dxa" w:w="3402"/>
-            <w:tcBorders>
-              <w:top w:val="single" w:color="D9D9D9" w:sz="2"/>
-              <w:left w:val="single" w:color="D9D9D9" w:sz="2"/>
-              <w:bottom w:val="single" w:color="D9D9D9" w:sz="2"/>
-              <w:right w:val="single" w:color="D9D9D9" w:sz="2"/>
-            </w:tcBorders>
+            <w:tcW w:type="dxa" w:w="3000"/>
+            <w:tcMar>
+              <w:top w:type="dxa" w:w="100"/>
+              <w:left w:type="dxa" w:w="100"/>
+              <w:bottom w:type="dxa" w:w="100"/>
+              <w:right w:type="dxa" w:w="100"/>
+            </w:tcMar>
             <w:vAlign w:val="center"/>
           </w:tcPr>
           <w:p>
             <w:pPr>
-              <w:spacing w:after="80" w:before="120"/>
               <w:jc w:val="center"/>
             </w:pPr>
             <w:r>
               <w:drawing>
                 <wp:inline distT="0" distB="0" distL="0" distR="0">
-                  <wp:extent cx="1085850" cy="1143000"/>
+                  <wp:extent cx="1143000" cy="1123950"/>
                   <wp:effectExtent t="0" r="0" b="0" l="0"/>
-                  <wp:docPr id="8" name="" descr="" title=""/>
+                  <wp:docPr id="7" name="" descr="" title=""/>
                   <wp:cNvGraphicFramePr>
                     <a:graphicFrameLocks xmlns:a="http://schemas.openxmlformats.org/drawingml/2006/main" noChangeAspect="1"/>
                   </wp:cNvGraphicFramePr>
@@ -706,7 +534,7 @@
                         <pic:spPr bwMode="auto">
                           <a:xfrm>
                             <a:off x="0" y="0"/>
-                            <a:ext cx="1085850" cy="1143000"/>
+                            <a:ext cx="1143000" cy="1123950"/>
                           </a:xfrm>
                           <a:prstGeom prst="rect">
                             <a:avLst/>
@@ -721,60 +549,46 @@
           </w:p>
           <w:p>
             <w:pPr>
-              <w:bidi/>
-              <w:spacing w:after="20"/>
               <w:jc w:val="center"/>
             </w:pPr>
             <w:r>
               <w:rPr>
-                <w:rFonts w:ascii="Arial" w:cs="Arial" w:eastAsia="Arial" w:hAnsi="Arial"/>
                 <w:b/>
                 <w:bCs/>
-                <w:sz w:val="20"/>
-                <w:szCs w:val="20"/>
               </w:rPr>
               <w:t xml:space="preserve">צידנית אישית</w:t>
             </w:r>
           </w:p>
           <w:p>
             <w:pPr>
-              <w:bidi/>
-              <w:spacing w:after="120"/>
-              <w:jc w:val="center"/>
-            </w:pPr>
-            <w:r>
-              <w:rPr>
-                <w:rFonts w:ascii="Arial" w:cs="Arial" w:eastAsia="Arial" w:hAnsi="Arial"/>
-                <w:color w:val="595959"/>
-                <w:sz w:val="18"/>
-                <w:szCs w:val="18"/>
-              </w:rPr>
-              <w:t xml:space="preserve">כחול</w:t>
+              <w:jc w:val="center"/>
+            </w:pPr>
+            <w:r>
+              <w:t xml:space="preserve">אפור</w:t>
             </w:r>
           </w:p>
         </w:tc>
         <w:tc>
           <w:tcPr>
-            <w:tcW w:type="dxa" w:w="3402"/>
-            <w:tcBorders>
-              <w:top w:val="single" w:color="D9D9D9" w:sz="2"/>
-              <w:left w:val="single" w:color="D9D9D9" w:sz="2"/>
-              <w:bottom w:val="single" w:color="D9D9D9" w:sz="2"/>
-              <w:right w:val="single" w:color="D9D9D9" w:sz="2"/>
-            </w:tcBorders>
+            <w:tcW w:type="dxa" w:w="3000"/>
+            <w:tcMar>
+              <w:top w:type="dxa" w:w="100"/>
+              <w:left w:type="dxa" w:w="100"/>
+              <w:bottom w:type="dxa" w:w="100"/>
+              <w:right w:type="dxa" w:w="100"/>
+            </w:tcMar>
             <w:vAlign w:val="center"/>
           </w:tcPr>
           <w:p>
             <w:pPr>
-              <w:spacing w:after="80" w:before="120"/>
               <w:jc w:val="center"/>
             </w:pPr>
             <w:r>
               <w:drawing>
                 <wp:inline distT="0" distB="0" distL="0" distR="0">
-                  <wp:extent cx="1143000" cy="1143000"/>
+                  <wp:extent cx="1085850" cy="1143000"/>
                   <wp:effectExtent t="0" r="0" b="0" l="0"/>
-                  <wp:docPr id="9" name="" descr="" title=""/>
+                  <wp:docPr id="8" name="" descr="" title=""/>
                   <wp:cNvGraphicFramePr>
                     <a:graphicFrameLocks xmlns:a="http://schemas.openxmlformats.org/drawingml/2006/main" noChangeAspect="1"/>
                   </wp:cNvGraphicFramePr>
@@ -797,7 +611,7 @@
                         <pic:spPr bwMode="auto">
                           <a:xfrm>
                             <a:off x="0" y="0"/>
-                            <a:ext cx="1143000" cy="1143000"/>
+                            <a:ext cx="1085850" cy="1143000"/>
                           </a:xfrm>
                           <a:prstGeom prst="rect">
                             <a:avLst/>
@@ -812,62 +626,46 @@
           </w:p>
           <w:p>
             <w:pPr>
-              <w:bidi/>
-              <w:spacing w:after="20"/>
               <w:jc w:val="center"/>
             </w:pPr>
             <w:r>
               <w:rPr>
-                <w:rFonts w:ascii="Arial" w:cs="Arial" w:eastAsia="Arial" w:hAnsi="Arial"/>
                 <w:b/>
                 <w:bCs/>
-                <w:sz w:val="20"/>
-                <w:szCs w:val="20"/>
               </w:rPr>
               <w:t xml:space="preserve">צידנית אישית</w:t>
             </w:r>
           </w:p>
           <w:p>
             <w:pPr>
-              <w:bidi/>
-              <w:spacing w:after="120"/>
-              <w:jc w:val="center"/>
-            </w:pPr>
-            <w:r>
-              <w:rPr>
-                <w:rFonts w:ascii="Arial" w:cs="Arial" w:eastAsia="Arial" w:hAnsi="Arial"/>
-                <w:color w:val="595959"/>
-                <w:sz w:val="18"/>
-                <w:szCs w:val="18"/>
-              </w:rPr>
-              <w:t xml:space="preserve">לבן</w:t>
+              <w:jc w:val="center"/>
+            </w:pPr>
+            <w:r>
+              <w:t xml:space="preserve">כחול</w:t>
             </w:r>
           </w:p>
         </w:tc>
-      </w:tr>
-      <w:tr>
         <w:tc>
           <w:tcPr>
-            <w:tcW w:type="dxa" w:w="3402"/>
-            <w:tcBorders>
-              <w:top w:val="single" w:color="D9D9D9" w:sz="2"/>
-              <w:left w:val="single" w:color="D9D9D9" w:sz="2"/>
-              <w:bottom w:val="single" w:color="D9D9D9" w:sz="2"/>
-              <w:right w:val="single" w:color="D9D9D9" w:sz="2"/>
-            </w:tcBorders>
+            <w:tcW w:type="dxa" w:w="3000"/>
+            <w:tcMar>
+              <w:top w:type="dxa" w:w="100"/>
+              <w:left w:type="dxa" w:w="100"/>
+              <w:bottom w:type="dxa" w:w="100"/>
+              <w:right w:type="dxa" w:w="100"/>
+            </w:tcMar>
             <w:vAlign w:val="center"/>
           </w:tcPr>
           <w:p>
             <w:pPr>
-              <w:spacing w:after="80" w:before="120"/>
               <w:jc w:val="center"/>
             </w:pPr>
             <w:r>
               <w:drawing>
                 <wp:inline distT="0" distB="0" distL="0" distR="0">
-                  <wp:extent cx="1095375" cy="1143000"/>
+                  <wp:extent cx="1143000" cy="1143000"/>
                   <wp:effectExtent t="0" r="0" b="0" l="0"/>
-                  <wp:docPr id="10" name="" descr="" title=""/>
+                  <wp:docPr id="9" name="" descr="" title=""/>
                   <wp:cNvGraphicFramePr>
                     <a:graphicFrameLocks xmlns:a="http://schemas.openxmlformats.org/drawingml/2006/main" noChangeAspect="1"/>
                   </wp:cNvGraphicFramePr>
@@ -890,7 +688,7 @@
                         <pic:spPr bwMode="auto">
                           <a:xfrm>
                             <a:off x="0" y="0"/>
-                            <a:ext cx="1095375" cy="1143000"/>
+                            <a:ext cx="1143000" cy="1143000"/>
                           </a:xfrm>
                           <a:prstGeom prst="rect">
                             <a:avLst/>
@@ -905,60 +703,48 @@
           </w:p>
           <w:p>
             <w:pPr>
-              <w:bidi/>
-              <w:spacing w:after="20"/>
               <w:jc w:val="center"/>
             </w:pPr>
             <w:r>
               <w:rPr>
-                <w:rFonts w:ascii="Arial" w:cs="Arial" w:eastAsia="Arial" w:hAnsi="Arial"/>
                 <w:b/>
                 <w:bCs/>
-                <w:sz w:val="20"/>
-                <w:szCs w:val="20"/>
               </w:rPr>
               <w:t xml:space="preserve">צידנית אישית</w:t>
             </w:r>
           </w:p>
           <w:p>
             <w:pPr>
-              <w:bidi/>
-              <w:spacing w:after="120"/>
-              <w:jc w:val="center"/>
-            </w:pPr>
-            <w:r>
-              <w:rPr>
-                <w:rFonts w:ascii="Arial" w:cs="Arial" w:eastAsia="Arial" w:hAnsi="Arial"/>
-                <w:color w:val="595959"/>
-                <w:sz w:val="18"/>
-                <w:szCs w:val="18"/>
-              </w:rPr>
-              <w:t xml:space="preserve">שחור</w:t>
+              <w:jc w:val="center"/>
+            </w:pPr>
+            <w:r>
+              <w:t xml:space="preserve">לבן</w:t>
             </w:r>
           </w:p>
         </w:tc>
+      </w:tr>
+      <w:tr>
         <w:tc>
           <w:tcPr>
-            <w:tcW w:type="dxa" w:w="3402"/>
-            <w:tcBorders>
-              <w:top w:val="single" w:color="D9D9D9" w:sz="2"/>
-              <w:left w:val="single" w:color="D9D9D9" w:sz="2"/>
-              <w:bottom w:val="single" w:color="D9D9D9" w:sz="2"/>
-              <w:right w:val="single" w:color="D9D9D9" w:sz="2"/>
-            </w:tcBorders>
+            <w:tcW w:type="dxa" w:w="3000"/>
+            <w:tcMar>
+              <w:top w:type="dxa" w:w="100"/>
+              <w:left w:type="dxa" w:w="100"/>
+              <w:bottom w:type="dxa" w:w="100"/>
+              <w:right w:type="dxa" w:w="100"/>
+            </w:tcMar>
             <w:vAlign w:val="center"/>
           </w:tcPr>
           <w:p>
             <w:pPr>
-              <w:spacing w:after="80" w:before="120"/>
               <w:jc w:val="center"/>
             </w:pPr>
             <w:r>
               <w:drawing>
                 <wp:inline distT="0" distB="0" distL="0" distR="0">
-                  <wp:extent cx="1143000" cy="914400"/>
+                  <wp:extent cx="1095375" cy="1143000"/>
                   <wp:effectExtent t="0" r="0" b="0" l="0"/>
-                  <wp:docPr id="11" name="" descr="" title=""/>
+                  <wp:docPr id="10" name="" descr="" title=""/>
                   <wp:cNvGraphicFramePr>
                     <a:graphicFrameLocks xmlns:a="http://schemas.openxmlformats.org/drawingml/2006/main" noChangeAspect="1"/>
                   </wp:cNvGraphicFramePr>
@@ -981,7 +767,7 @@
                         <pic:spPr bwMode="auto">
                           <a:xfrm>
                             <a:off x="0" y="0"/>
-                            <a:ext cx="1143000" cy="914400"/>
+                            <a:ext cx="1095375" cy="1143000"/>
                           </a:xfrm>
                           <a:prstGeom prst="rect">
                             <a:avLst/>
@@ -996,60 +782,46 @@
           </w:p>
           <w:p>
             <w:pPr>
-              <w:bidi/>
-              <w:spacing w:after="20"/>
               <w:jc w:val="center"/>
             </w:pPr>
             <w:r>
               <w:rPr>
-                <w:rFonts w:ascii="Arial" w:cs="Arial" w:eastAsia="Arial" w:hAnsi="Arial"/>
                 <w:b/>
                 <w:bCs/>
-                <w:sz w:val="20"/>
-                <w:szCs w:val="20"/>
               </w:rPr>
-              <w:t xml:space="preserve">קופסאות אוכל</w:t>
-            </w:r>
-          </w:p>
-          <w:p>
-            <w:pPr>
-              <w:bidi/>
-              <w:spacing w:after="120"/>
-              <w:jc w:val="center"/>
-            </w:pPr>
-            <w:r>
-              <w:rPr>
-                <w:rFonts w:ascii="Arial" w:cs="Arial" w:eastAsia="Arial" w:hAnsi="Arial"/>
-                <w:color w:val="595959"/>
-                <w:sz w:val="18"/>
-                <w:szCs w:val="18"/>
-              </w:rPr>
-              <w:t xml:space="preserve">סיליקון 2 תאים + עגולה שתי קומות | לבן</w:t>
+              <w:t xml:space="preserve">צידנית אישית</w:t>
+            </w:r>
+          </w:p>
+          <w:p>
+            <w:pPr>
+              <w:jc w:val="center"/>
+            </w:pPr>
+            <w:r>
+              <w:t xml:space="preserve">שחור</w:t>
             </w:r>
           </w:p>
         </w:tc>
         <w:tc>
           <w:tcPr>
-            <w:tcW w:type="dxa" w:w="3402"/>
-            <w:tcBorders>
-              <w:top w:val="single" w:color="D9D9D9" w:sz="2"/>
-              <w:left w:val="single" w:color="D9D9D9" w:sz="2"/>
-              <w:bottom w:val="single" w:color="D9D9D9" w:sz="2"/>
-              <w:right w:val="single" w:color="D9D9D9" w:sz="2"/>
-            </w:tcBorders>
+            <w:tcW w:type="dxa" w:w="3000"/>
+            <w:tcMar>
+              <w:top w:type="dxa" w:w="100"/>
+              <w:left w:type="dxa" w:w="100"/>
+              <w:bottom w:type="dxa" w:w="100"/>
+              <w:right w:type="dxa" w:w="100"/>
+            </w:tcMar>
             <w:vAlign w:val="center"/>
           </w:tcPr>
           <w:p>
             <w:pPr>
-              <w:spacing w:after="80" w:before="120"/>
               <w:jc w:val="center"/>
             </w:pPr>
             <w:r>
               <w:drawing>
                 <wp:inline distT="0" distB="0" distL="0" distR="0">
-                  <wp:extent cx="857250" cy="1143000"/>
+                  <wp:extent cx="1143000" cy="914400"/>
                   <wp:effectExtent t="0" r="0" b="0" l="0"/>
-                  <wp:docPr id="12" name="" descr="" title=""/>
+                  <wp:docPr id="11" name="" descr="" title=""/>
                   <wp:cNvGraphicFramePr>
                     <a:graphicFrameLocks xmlns:a="http://schemas.openxmlformats.org/drawingml/2006/main" noChangeAspect="1"/>
                   </wp:cNvGraphicFramePr>
@@ -1072,7 +844,7 @@
                         <pic:spPr bwMode="auto">
                           <a:xfrm>
                             <a:off x="0" y="0"/>
-                            <a:ext cx="857250" cy="1143000"/>
+                            <a:ext cx="1143000" cy="914400"/>
                           </a:xfrm>
                           <a:prstGeom prst="rect">
                             <a:avLst/>
@@ -1087,62 +859,46 @@
           </w:p>
           <w:p>
             <w:pPr>
-              <w:bidi/>
-              <w:spacing w:after="20"/>
               <w:jc w:val="center"/>
             </w:pPr>
             <w:r>
               <w:rPr>
-                <w:rFonts w:ascii="Arial" w:cs="Arial" w:eastAsia="Arial" w:hAnsi="Arial"/>
                 <w:b/>
                 <w:bCs/>
-                <w:sz w:val="20"/>
-                <w:szCs w:val="20"/>
               </w:rPr>
-              <w:t xml:space="preserve">קופסת אוכל סגירת סיליקון</w:t>
-            </w:r>
-          </w:p>
-          <w:p>
-            <w:pPr>
-              <w:bidi/>
-              <w:spacing w:after="120"/>
-              <w:jc w:val="center"/>
-            </w:pPr>
-            <w:r>
-              <w:rPr>
-                <w:rFonts w:ascii="Arial" w:cs="Arial" w:eastAsia="Arial" w:hAnsi="Arial"/>
-                <w:color w:val="595959"/>
-                <w:sz w:val="18"/>
-                <w:szCs w:val="18"/>
-              </w:rPr>
-              <w:t xml:space="preserve">2 תאים + סכין ומזלג | כחול</w:t>
+              <w:t xml:space="preserve">קופסאות אוכל</w:t>
+            </w:r>
+          </w:p>
+          <w:p>
+            <w:pPr>
+              <w:jc w:val="center"/>
+            </w:pPr>
+            <w:r>
+              <w:t xml:space="preserve">סיליקון 2 תאים + עגולה שתי קומות | לבן</w:t>
             </w:r>
           </w:p>
         </w:tc>
-      </w:tr>
-      <w:tr>
         <w:tc>
           <w:tcPr>
-            <w:tcW w:type="dxa" w:w="3402"/>
-            <w:tcBorders>
-              <w:top w:val="single" w:color="D9D9D9" w:sz="2"/>
-              <w:left w:val="single" w:color="D9D9D9" w:sz="2"/>
-              <w:bottom w:val="single" w:color="D9D9D9" w:sz="2"/>
-              <w:right w:val="single" w:color="D9D9D9" w:sz="2"/>
-            </w:tcBorders>
+            <w:tcW w:type="dxa" w:w="3000"/>
+            <w:tcMar>
+              <w:top w:type="dxa" w:w="100"/>
+              <w:left w:type="dxa" w:w="100"/>
+              <w:bottom w:type="dxa" w:w="100"/>
+              <w:right w:type="dxa" w:w="100"/>
+            </w:tcMar>
             <w:vAlign w:val="center"/>
           </w:tcPr>
           <w:p>
             <w:pPr>
-              <w:spacing w:after="80" w:before="120"/>
               <w:jc w:val="center"/>
             </w:pPr>
             <w:r>
               <w:drawing>
                 <wp:inline distT="0" distB="0" distL="0" distR="0">
-                  <wp:extent cx="704850" cy="1143000"/>
+                  <wp:extent cx="857250" cy="1143000"/>
                   <wp:effectExtent t="0" r="0" b="0" l="0"/>
-                  <wp:docPr id="14" name="" descr="" title=""/>
+                  <wp:docPr id="12" name="" descr="" title=""/>
                   <wp:cNvGraphicFramePr>
                     <a:graphicFrameLocks xmlns:a="http://schemas.openxmlformats.org/drawingml/2006/main" noChangeAspect="1"/>
                   </wp:cNvGraphicFramePr>
@@ -1165,7 +921,7 @@
                         <pic:spPr bwMode="auto">
                           <a:xfrm>
                             <a:off x="0" y="0"/>
-                            <a:ext cx="704850" cy="1143000"/>
+                            <a:ext cx="857250" cy="1143000"/>
                           </a:xfrm>
                           <a:prstGeom prst="rect">
                             <a:avLst/>
@@ -1180,58 +936,46 @@
           </w:p>
           <w:p>
             <w:pPr>
-              <w:bidi/>
-              <w:spacing w:after="20"/>
               <w:jc w:val="center"/>
             </w:pPr>
             <w:r>
               <w:rPr>
-                <w:rFonts w:ascii="Arial" w:cs="Arial" w:eastAsia="Arial" w:hAnsi="Arial"/>
                 <w:b/>
                 <w:bCs/>
-                <w:sz w:val="20"/>
-                <w:szCs w:val="20"/>
               </w:rPr>
-              <w:t xml:space="preserve">תיק גב איכותי למחשב</w:t>
-            </w:r>
-          </w:p>
-          <w:p>
-            <w:pPr>
-              <w:bidi/>
-              <w:spacing w:after="120"/>
-              <w:jc w:val="center"/>
-            </w:pPr>
-            <w:r>
-              <w:rPr>
-                <w:rFonts w:ascii="Arial" w:cs="Arial" w:eastAsia="Arial" w:hAnsi="Arial"/>
-                <w:color w:val="595959"/>
-                <w:sz w:val="18"/>
-                <w:szCs w:val="18"/>
-              </w:rPr>
-              <w:t xml:space="preserve">כחול</w:t>
+              <w:t xml:space="preserve">קופסת אוכל סגירת סיליקון</w:t>
+            </w:r>
+          </w:p>
+          <w:p>
+            <w:pPr>
+              <w:jc w:val="center"/>
+            </w:pPr>
+            <w:r>
+              <w:t xml:space="preserve">2 תאים + סכין ומזלג | כחול</w:t>
             </w:r>
           </w:p>
         </w:tc>
+      </w:tr>
+      <w:tr>
         <w:tc>
           <w:tcPr>
-            <w:tcW w:type="dxa" w:w="3402"/>
-            <w:tcBorders>
-              <w:top w:val="single" w:color="D9D9D9" w:sz="2"/>
-              <w:left w:val="single" w:color="D9D9D9" w:sz="2"/>
-              <w:bottom w:val="single" w:color="D9D9D9" w:sz="2"/>
-              <w:right w:val="single" w:color="D9D9D9" w:sz="2"/>
-            </w:tcBorders>
+            <w:tcW w:type="dxa" w:w="3000"/>
+            <w:tcMar>
+              <w:top w:type="dxa" w:w="100"/>
+              <w:left w:type="dxa" w:w="100"/>
+              <w:bottom w:type="dxa" w:w="100"/>
+              <w:right w:type="dxa" w:w="100"/>
+            </w:tcMar>
             <w:vAlign w:val="center"/>
           </w:tcPr>
           <w:p>
             <w:pPr>
-              <w:spacing w:after="80" w:before="120"/>
               <w:jc w:val="center"/>
             </w:pPr>
             <w:r>
               <w:drawing>
                 <wp:inline distT="0" distB="0" distL="0" distR="0">
-                  <wp:extent cx="657225" cy="1143000"/>
+                  <wp:extent cx="704850" cy="1143000"/>
                   <wp:effectExtent t="0" r="0" b="0" l="0"/>
                   <wp:docPr id="13" name="" descr="" title=""/>
                   <wp:cNvGraphicFramePr>
@@ -1256,7 +1000,7 @@
                         <pic:spPr bwMode="auto">
                           <a:xfrm>
                             <a:off x="0" y="0"/>
-                            <a:ext cx="657225" cy="1143000"/>
+                            <a:ext cx="704850" cy="1143000"/>
                           </a:xfrm>
                           <a:prstGeom prst="rect">
                             <a:avLst/>
@@ -1271,60 +1015,46 @@
           </w:p>
           <w:p>
             <w:pPr>
-              <w:bidi/>
-              <w:spacing w:after="20"/>
               <w:jc w:val="center"/>
             </w:pPr>
             <w:r>
               <w:rPr>
-                <w:rFonts w:ascii="Arial" w:cs="Arial" w:eastAsia="Arial" w:hAnsi="Arial"/>
                 <w:b/>
                 <w:bCs/>
-                <w:sz w:val="20"/>
-                <w:szCs w:val="20"/>
               </w:rPr>
-              <w:t xml:space="preserve">תיק גב איכותי למחשב</w:t>
-            </w:r>
-          </w:p>
-          <w:p>
-            <w:pPr>
-              <w:bidi/>
-              <w:spacing w:after="120"/>
-              <w:jc w:val="center"/>
-            </w:pPr>
-            <w:r>
-              <w:rPr>
-                <w:rFonts w:ascii="Arial" w:cs="Arial" w:eastAsia="Arial" w:hAnsi="Arial"/>
-                <w:color w:val="595959"/>
-                <w:sz w:val="18"/>
-                <w:szCs w:val="18"/>
-              </w:rPr>
-              <w:t xml:space="preserve">שחור</w:t>
+              <w:t xml:space="preserve">תיק גב איכותי למחשב דגם A - כחול</w:t>
+            </w:r>
+          </w:p>
+          <w:p>
+            <w:pPr>
+              <w:jc w:val="center"/>
+            </w:pPr>
+            <w:r>
+              <w:t xml:space="preserve">כחול</w:t>
             </w:r>
           </w:p>
         </w:tc>
         <w:tc>
           <w:tcPr>
-            <w:tcW w:type="dxa" w:w="3402"/>
-            <w:tcBorders>
-              <w:top w:val="single" w:color="D9D9D9" w:sz="2"/>
-              <w:left w:val="single" w:color="D9D9D9" w:sz="2"/>
-              <w:bottom w:val="single" w:color="D9D9D9" w:sz="2"/>
-              <w:right w:val="single" w:color="D9D9D9" w:sz="2"/>
-            </w:tcBorders>
+            <w:tcW w:type="dxa" w:w="3000"/>
+            <w:tcMar>
+              <w:top w:type="dxa" w:w="100"/>
+              <w:left w:type="dxa" w:w="100"/>
+              <w:bottom w:type="dxa" w:w="100"/>
+              <w:right w:type="dxa" w:w="100"/>
+            </w:tcMar>
             <w:vAlign w:val="center"/>
           </w:tcPr>
           <w:p>
             <w:pPr>
-              <w:spacing w:after="80" w:before="120"/>
               <w:jc w:val="center"/>
             </w:pPr>
             <w:r>
               <w:drawing>
                 <wp:inline distT="0" distB="0" distL="0" distR="0">
-                  <wp:extent cx="857250" cy="1143000"/>
+                  <wp:extent cx="657225" cy="1143000"/>
                   <wp:effectExtent t="0" r="0" b="0" l="0"/>
-                  <wp:docPr id="15" name="" descr="" title=""/>
+                  <wp:docPr id="14" name="" descr="" title=""/>
                   <wp:cNvGraphicFramePr>
                     <a:graphicFrameLocks xmlns:a="http://schemas.openxmlformats.org/drawingml/2006/main" noChangeAspect="1"/>
                   </wp:cNvGraphicFramePr>
@@ -1347,7 +1077,7 @@
                         <pic:spPr bwMode="auto">
                           <a:xfrm>
                             <a:off x="0" y="0"/>
-                            <a:ext cx="857250" cy="1143000"/>
+                            <a:ext cx="657225" cy="1143000"/>
                           </a:xfrm>
                           <a:prstGeom prst="rect">
                             <a:avLst/>
@@ -1362,62 +1092,46 @@
           </w:p>
           <w:p>
             <w:pPr>
-              <w:bidi/>
-              <w:spacing w:after="20"/>
               <w:jc w:val="center"/>
             </w:pPr>
             <w:r>
               <w:rPr>
-                <w:rFonts w:ascii="Arial" w:cs="Arial" w:eastAsia="Arial" w:hAnsi="Arial"/>
                 <w:b/>
                 <w:bCs/>
-                <w:sz w:val="20"/>
-                <w:szCs w:val="20"/>
               </w:rPr>
-              <w:t xml:space="preserve">תיק גב איכותי למחשב אפור</w:t>
-            </w:r>
-          </w:p>
-          <w:p>
-            <w:pPr>
-              <w:bidi/>
-              <w:spacing w:after="120"/>
-              <w:jc w:val="center"/>
-            </w:pPr>
-            <w:r>
-              <w:rPr>
-                <w:rFonts w:ascii="Arial" w:cs="Arial" w:eastAsia="Arial" w:hAnsi="Arial"/>
-                <w:color w:val="595959"/>
-                <w:sz w:val="18"/>
-                <w:szCs w:val="18"/>
-              </w:rPr>
-              <w:t xml:space="preserve">אפור</w:t>
+              <w:t xml:space="preserve">תיק גב איכותי למחשב דגם A - שחור</w:t>
+            </w:r>
+          </w:p>
+          <w:p>
+            <w:pPr>
+              <w:jc w:val="center"/>
+            </w:pPr>
+            <w:r>
+              <w:t xml:space="preserve">שחור</w:t>
             </w:r>
           </w:p>
         </w:tc>
-      </w:tr>
-      <w:tr>
         <w:tc>
           <w:tcPr>
-            <w:tcW w:type="dxa" w:w="3402"/>
-            <w:tcBorders>
-              <w:top w:val="single" w:color="D9D9D9" w:sz="2"/>
-              <w:left w:val="single" w:color="D9D9D9" w:sz="2"/>
-              <w:bottom w:val="single" w:color="D9D9D9" w:sz="2"/>
-              <w:right w:val="single" w:color="D9D9D9" w:sz="2"/>
-            </w:tcBorders>
+            <w:tcW w:type="dxa" w:w="3000"/>
+            <w:tcMar>
+              <w:top w:type="dxa" w:w="100"/>
+              <w:left w:type="dxa" w:w="100"/>
+              <w:bottom w:type="dxa" w:w="100"/>
+              <w:right w:type="dxa" w:w="100"/>
+            </w:tcMar>
             <w:vAlign w:val="center"/>
           </w:tcPr>
           <w:p>
             <w:pPr>
-              <w:spacing w:after="80" w:before="120"/>
               <w:jc w:val="center"/>
             </w:pPr>
             <w:r>
               <w:drawing>
                 <wp:inline distT="0" distB="0" distL="0" distR="0">
-                  <wp:extent cx="857250" cy="1143000"/>
+                  <wp:extent cx="914400" cy="1143000"/>
                   <wp:effectExtent t="0" r="0" b="0" l="0"/>
-                  <wp:docPr id="17" name="" descr="" title=""/>
+                  <wp:docPr id="15" name="" descr="" title=""/>
                   <wp:cNvGraphicFramePr>
                     <a:graphicFrameLocks xmlns:a="http://schemas.openxmlformats.org/drawingml/2006/main" noChangeAspect="1"/>
                   </wp:cNvGraphicFramePr>
@@ -1440,7 +1154,7 @@
                         <pic:spPr bwMode="auto">
                           <a:xfrm>
                             <a:off x="0" y="0"/>
-                            <a:ext cx="857250" cy="1143000"/>
+                            <a:ext cx="914400" cy="1143000"/>
                           </a:xfrm>
                           <a:prstGeom prst="rect">
                             <a:avLst/>
@@ -1455,52 +1169,40 @@
           </w:p>
           <w:p>
             <w:pPr>
-              <w:bidi/>
-              <w:spacing w:after="20"/>
               <w:jc w:val="center"/>
             </w:pPr>
             <w:r>
               <w:rPr>
-                <w:rFonts w:ascii="Arial" w:cs="Arial" w:eastAsia="Arial" w:hAnsi="Arial"/>
                 <w:b/>
                 <w:bCs/>
-                <w:sz w:val="20"/>
-                <w:szCs w:val="20"/>
               </w:rPr>
-              <w:t xml:space="preserve">תיק גב מפואר למחשב דגם A</w:t>
-            </w:r>
-          </w:p>
-          <w:p>
-            <w:pPr>
-              <w:bidi/>
-              <w:spacing w:after="120"/>
-              <w:jc w:val="center"/>
-            </w:pPr>
-            <w:r>
-              <w:rPr>
-                <w:rFonts w:ascii="Arial" w:cs="Arial" w:eastAsia="Arial" w:hAnsi="Arial"/>
-                <w:color w:val="595959"/>
-                <w:sz w:val="18"/>
-                <w:szCs w:val="18"/>
-              </w:rPr>
-              <w:t xml:space="preserve">כחול</w:t>
+              <w:t xml:space="preserve">תיק גב איכותי למחשב דגם A - אפור</w:t>
+            </w:r>
+          </w:p>
+          <w:p>
+            <w:pPr>
+              <w:jc w:val="center"/>
+            </w:pPr>
+            <w:r>
+              <w:t xml:space="preserve">אפור</w:t>
             </w:r>
           </w:p>
         </w:tc>
+      </w:tr>
+      <w:tr>
         <w:tc>
           <w:tcPr>
-            <w:tcW w:type="dxa" w:w="3402"/>
-            <w:tcBorders>
-              <w:top w:val="single" w:color="D9D9D9" w:sz="2"/>
-              <w:left w:val="single" w:color="D9D9D9" w:sz="2"/>
-              <w:bottom w:val="single" w:color="D9D9D9" w:sz="2"/>
-              <w:right w:val="single" w:color="D9D9D9" w:sz="2"/>
-            </w:tcBorders>
+            <w:tcW w:type="dxa" w:w="3000"/>
+            <w:tcMar>
+              <w:top w:type="dxa" w:w="100"/>
+              <w:left w:type="dxa" w:w="100"/>
+              <w:bottom w:type="dxa" w:w="100"/>
+              <w:right w:type="dxa" w:w="100"/>
+            </w:tcMar>
             <w:vAlign w:val="center"/>
           </w:tcPr>
           <w:p>
             <w:pPr>
-              <w:spacing w:after="80" w:before="120"/>
               <w:jc w:val="center"/>
             </w:pPr>
             <w:r>
@@ -1546,60 +1248,46 @@
           </w:p>
           <w:p>
             <w:pPr>
-              <w:bidi/>
-              <w:spacing w:after="20"/>
               <w:jc w:val="center"/>
             </w:pPr>
             <w:r>
               <w:rPr>
-                <w:rFonts w:ascii="Arial" w:cs="Arial" w:eastAsia="Arial" w:hAnsi="Arial"/>
                 <w:b/>
                 <w:bCs/>
-                <w:sz w:val="20"/>
-                <w:szCs w:val="20"/>
               </w:rPr>
-              <w:t xml:space="preserve">תיק גב מפואר למחשב דגם B</w:t>
-            </w:r>
-          </w:p>
-          <w:p>
-            <w:pPr>
-              <w:bidi/>
-              <w:spacing w:after="120"/>
-              <w:jc w:val="center"/>
-            </w:pPr>
-            <w:r>
-              <w:rPr>
-                <w:rFonts w:ascii="Arial" w:cs="Arial" w:eastAsia="Arial" w:hAnsi="Arial"/>
-                <w:color w:val="595959"/>
-                <w:sz w:val="18"/>
-                <w:szCs w:val="18"/>
-              </w:rPr>
-              <w:t xml:space="preserve">שחור</w:t>
+              <w:t xml:space="preserve">תיק גב מפואר למחשב דגם B - כחול</w:t>
+            </w:r>
+          </w:p>
+          <w:p>
+            <w:pPr>
+              <w:jc w:val="center"/>
+            </w:pPr>
+            <w:r>
+              <w:t xml:space="preserve">כחול</w:t>
             </w:r>
           </w:p>
         </w:tc>
         <w:tc>
           <w:tcPr>
-            <w:tcW w:type="dxa" w:w="3402"/>
-            <w:tcBorders>
-              <w:top w:val="single" w:color="D9D9D9" w:sz="2"/>
-              <w:left w:val="single" w:color="D9D9D9" w:sz="2"/>
-              <w:bottom w:val="single" w:color="D9D9D9" w:sz="2"/>
-              <w:right w:val="single" w:color="D9D9D9" w:sz="2"/>
-            </w:tcBorders>
+            <w:tcW w:type="dxa" w:w="3000"/>
+            <w:tcMar>
+              <w:top w:type="dxa" w:w="100"/>
+              <w:left w:type="dxa" w:w="100"/>
+              <w:bottom w:type="dxa" w:w="100"/>
+              <w:right w:type="dxa" w:w="100"/>
+            </w:tcMar>
             <w:vAlign w:val="center"/>
           </w:tcPr>
           <w:p>
             <w:pPr>
-              <w:spacing w:after="80" w:before="120"/>
               <w:jc w:val="center"/>
             </w:pPr>
             <w:r>
               <w:drawing>
                 <wp:inline distT="0" distB="0" distL="0" distR="0">
-                  <wp:extent cx="1143000" cy="857250"/>
+                  <wp:extent cx="857250" cy="1143000"/>
                   <wp:effectExtent t="0" r="0" b="0" l="0"/>
-                  <wp:docPr id="18" name="" descr="" title=""/>
+                  <wp:docPr id="17" name="" descr="" title=""/>
                   <wp:cNvGraphicFramePr>
                     <a:graphicFrameLocks xmlns:a="http://schemas.openxmlformats.org/drawingml/2006/main" noChangeAspect="1"/>
                   </wp:cNvGraphicFramePr>
@@ -1622,7 +1310,7 @@
                         <pic:spPr bwMode="auto">
                           <a:xfrm>
                             <a:off x="0" y="0"/>
-                            <a:ext cx="1143000" cy="857250"/>
+                            <a:ext cx="857250" cy="1143000"/>
                           </a:xfrm>
                           <a:prstGeom prst="rect">
                             <a:avLst/>
@@ -1637,62 +1325,46 @@
           </w:p>
           <w:p>
             <w:pPr>
-              <w:bidi/>
-              <w:spacing w:after="20"/>
               <w:jc w:val="center"/>
             </w:pPr>
             <w:r>
               <w:rPr>
-                <w:rFonts w:ascii="Arial" w:cs="Arial" w:eastAsia="Arial" w:hAnsi="Arial"/>
                 <w:b/>
                 <w:bCs/>
-                <w:sz w:val="20"/>
-                <w:szCs w:val="20"/>
               </w:rPr>
-              <w:t xml:space="preserve">תיק למחשב</w:t>
-            </w:r>
-          </w:p>
-          <w:p>
-            <w:pPr>
-              <w:bidi/>
-              <w:spacing w:after="120"/>
-              <w:jc w:val="center"/>
-            </w:pPr>
-            <w:r>
-              <w:rPr>
-                <w:rFonts w:ascii="Arial" w:cs="Arial" w:eastAsia="Arial" w:hAnsi="Arial"/>
-                <w:color w:val="595959"/>
-                <w:sz w:val="18"/>
-                <w:szCs w:val="18"/>
-              </w:rPr>
-              <w:t xml:space="preserve">רגיל</w:t>
+              <w:t xml:space="preserve">תיק גב מפואר למחשב דגם C - שחור</w:t>
+            </w:r>
+          </w:p>
+          <w:p>
+            <w:pPr>
+              <w:jc w:val="center"/>
+            </w:pPr>
+            <w:r>
+              <w:t xml:space="preserve">שחור</w:t>
             </w:r>
           </w:p>
         </w:tc>
-      </w:tr>
-      <w:tr>
         <w:tc>
           <w:tcPr>
-            <w:tcW w:type="dxa" w:w="3402"/>
-            <w:tcBorders>
-              <w:top w:val="single" w:color="D9D9D9" w:sz="2"/>
-              <w:left w:val="single" w:color="D9D9D9" w:sz="2"/>
-              <w:bottom w:val="single" w:color="D9D9D9" w:sz="2"/>
-              <w:right w:val="single" w:color="D9D9D9" w:sz="2"/>
-            </w:tcBorders>
+            <w:tcW w:type="dxa" w:w="3000"/>
+            <w:tcMar>
+              <w:top w:type="dxa" w:w="100"/>
+              <w:left w:type="dxa" w:w="100"/>
+              <w:bottom w:type="dxa" w:w="100"/>
+              <w:right w:type="dxa" w:w="100"/>
+            </w:tcMar>
             <w:vAlign w:val="center"/>
           </w:tcPr>
           <w:p>
             <w:pPr>
-              <w:spacing w:after="80" w:before="120"/>
               <w:jc w:val="center"/>
             </w:pPr>
             <w:r>
               <w:drawing>
                 <wp:inline distT="0" distB="0" distL="0" distR="0">
-                  <wp:extent cx="1143000" cy="1143000"/>
+                  <wp:extent cx="1143000" cy="857250"/>
                   <wp:effectExtent t="0" r="0" b="0" l="0"/>
-                  <wp:docPr id="19" name="" descr="" title=""/>
+                  <wp:docPr id="18" name="" descr="" title=""/>
                   <wp:cNvGraphicFramePr>
                     <a:graphicFrameLocks xmlns:a="http://schemas.openxmlformats.org/drawingml/2006/main" noChangeAspect="1"/>
                   </wp:cNvGraphicFramePr>
@@ -1715,7 +1387,7 @@
                         <pic:spPr bwMode="auto">
                           <a:xfrm>
                             <a:off x="0" y="0"/>
-                            <a:ext cx="1143000" cy="1143000"/>
+                            <a:ext cx="1143000" cy="857250"/>
                           </a:xfrm>
                           <a:prstGeom prst="rect">
                             <a:avLst/>
@@ -1730,52 +1402,40 @@
           </w:p>
           <w:p>
             <w:pPr>
-              <w:bidi/>
-              <w:spacing w:after="20"/>
               <w:jc w:val="center"/>
             </w:pPr>
             <w:r>
               <w:rPr>
-                <w:rFonts w:ascii="Arial" w:cs="Arial" w:eastAsia="Arial" w:hAnsi="Arial"/>
                 <w:b/>
                 <w:bCs/>
-                <w:sz w:val="20"/>
-                <w:szCs w:val="20"/>
               </w:rPr>
-              <w:t xml:space="preserve">תיק למחשב פולו ליין</w:t>
-            </w:r>
-          </w:p>
-          <w:p>
-            <w:pPr>
-              <w:bidi/>
-              <w:spacing w:after="120"/>
-              <w:jc w:val="center"/>
-            </w:pPr>
-            <w:r>
-              <w:rPr>
-                <w:rFonts w:ascii="Arial" w:cs="Arial" w:eastAsia="Arial" w:hAnsi="Arial"/>
-                <w:color w:val="595959"/>
-                <w:sz w:val="18"/>
-                <w:szCs w:val="18"/>
-              </w:rPr>
-              <w:t xml:space="preserve">מחומר ממוחזר</w:t>
+              <w:t xml:space="preserve">תיק למחשב</w:t>
+            </w:r>
+          </w:p>
+          <w:p>
+            <w:pPr>
+              <w:jc w:val="center"/>
+            </w:pPr>
+            <w:r>
+              <w:t xml:space="preserve">רגיל</w:t>
             </w:r>
           </w:p>
         </w:tc>
+      </w:tr>
+      <w:tr>
         <w:tc>
           <w:tcPr>
-            <w:tcW w:type="dxa" w:w="3402"/>
-            <w:tcBorders>
-              <w:top w:val="single" w:color="D9D9D9" w:sz="2"/>
-              <w:left w:val="single" w:color="D9D9D9" w:sz="2"/>
-              <w:bottom w:val="single" w:color="D9D9D9" w:sz="2"/>
-              <w:right w:val="single" w:color="D9D9D9" w:sz="2"/>
-            </w:tcBorders>
+            <w:tcW w:type="dxa" w:w="3000"/>
+            <w:tcMar>
+              <w:top w:type="dxa" w:w="100"/>
+              <w:left w:type="dxa" w:w="100"/>
+              <w:bottom w:type="dxa" w:w="100"/>
+              <w:right w:type="dxa" w:w="100"/>
+            </w:tcMar>
             <w:vAlign w:val="center"/>
           </w:tcPr>
           <w:p>
             <w:pPr>
-              <w:spacing w:after="80" w:before="120"/>
               <w:jc w:val="center"/>
             </w:pPr>
             <w:r>
@@ -1783,7 +1443,7 @@
                 <wp:inline distT="0" distB="0" distL="0" distR="0">
                   <wp:extent cx="1143000" cy="809625"/>
                   <wp:effectExtent t="0" r="0" b="0" l="0"/>
-                  <wp:docPr id="20" name="" descr="" title=""/>
+                  <wp:docPr id="19" name="" descr="" title=""/>
                   <wp:cNvGraphicFramePr>
                     <a:graphicFrameLocks xmlns:a="http://schemas.openxmlformats.org/drawingml/2006/main" noChangeAspect="1"/>
                   </wp:cNvGraphicFramePr>
@@ -1821,17 +1481,12 @@
           </w:p>
           <w:p>
             <w:pPr>
-              <w:bidi/>
-              <w:spacing w:after="120"/>
               <w:jc w:val="center"/>
             </w:pPr>
             <w:r>
               <w:rPr>
-                <w:rFonts w:ascii="Arial" w:cs="Arial" w:eastAsia="Arial" w:hAnsi="Arial"/>
                 <w:b/>
                 <w:bCs/>
-                <w:sz w:val="20"/>
-                <w:szCs w:val="20"/>
               </w:rPr>
               <w:t xml:space="preserve">תיק מחשב נייד</w:t>
             </w:r>
@@ -1839,18 +1494,17 @@
         </w:tc>
         <w:tc>
           <w:tcPr>
-            <w:tcW w:type="dxa" w:w="3402"/>
-            <w:tcBorders>
-              <w:top w:val="single" w:color="D9D9D9" w:sz="2"/>
-              <w:left w:val="single" w:color="D9D9D9" w:sz="2"/>
-              <w:bottom w:val="single" w:color="D9D9D9" w:sz="2"/>
-              <w:right w:val="single" w:color="D9D9D9" w:sz="2"/>
-            </w:tcBorders>
+            <w:tcW w:type="dxa" w:w="3000"/>
+            <w:tcMar>
+              <w:top w:type="dxa" w:w="100"/>
+              <w:left w:type="dxa" w:w="100"/>
+              <w:bottom w:type="dxa" w:w="100"/>
+              <w:right w:type="dxa" w:w="100"/>
+            </w:tcMar>
             <w:vAlign w:val="center"/>
           </w:tcPr>
           <w:p>
             <w:pPr>
-              <w:spacing w:after="80" w:before="120"/>
               <w:jc w:val="center"/>
             </w:pPr>
             <w:r>
@@ -1858,7 +1512,7 @@
                 <wp:inline distT="0" distB="0" distL="0" distR="0">
                   <wp:extent cx="857250" cy="1143000"/>
                   <wp:effectExtent t="0" r="0" b="0" l="0"/>
-                  <wp:docPr id="21" name="" descr="" title=""/>
+                  <wp:docPr id="20" name="" descr="" title=""/>
                   <wp:cNvGraphicFramePr>
                     <a:graphicFrameLocks xmlns:a="http://schemas.openxmlformats.org/drawingml/2006/main" noChangeAspect="1"/>
                   </wp:cNvGraphicFramePr>
@@ -1896,54 +1550,38 @@
           </w:p>
           <w:p>
             <w:pPr>
-              <w:bidi/>
-              <w:spacing w:after="20"/>
               <w:jc w:val="center"/>
             </w:pPr>
             <w:r>
               <w:rPr>
-                <w:rFonts w:ascii="Arial" w:cs="Arial" w:eastAsia="Arial" w:hAnsi="Arial"/>
                 <w:b/>
                 <w:bCs/>
-                <w:sz w:val="20"/>
-                <w:szCs w:val="20"/>
               </w:rPr>
               <w:t xml:space="preserve">תיק ספורט פולו</w:t>
             </w:r>
           </w:p>
           <w:p>
             <w:pPr>
-              <w:bidi/>
-              <w:spacing w:after="120"/>
-              <w:jc w:val="center"/>
-            </w:pPr>
-            <w:r>
-              <w:rPr>
-                <w:rFonts w:ascii="Arial" w:cs="Arial" w:eastAsia="Arial" w:hAnsi="Arial"/>
-                <w:color w:val="595959"/>
-                <w:sz w:val="18"/>
-                <w:szCs w:val="18"/>
-              </w:rPr>
+              <w:jc w:val="center"/>
+            </w:pPr>
+            <w:r>
               <w:t xml:space="preserve">אפור</w:t>
             </w:r>
           </w:p>
         </w:tc>
-      </w:tr>
-      <w:tr>
         <w:tc>
           <w:tcPr>
-            <w:tcW w:type="dxa" w:w="3402"/>
-            <w:tcBorders>
-              <w:top w:val="single" w:color="D9D9D9" w:sz="2"/>
-              <w:left w:val="single" w:color="D9D9D9" w:sz="2"/>
-              <w:bottom w:val="single" w:color="D9D9D9" w:sz="2"/>
-              <w:right w:val="single" w:color="D9D9D9" w:sz="2"/>
-            </w:tcBorders>
+            <w:tcW w:type="dxa" w:w="3000"/>
+            <w:tcMar>
+              <w:top w:type="dxa" w:w="100"/>
+              <w:left w:type="dxa" w:w="100"/>
+              <w:bottom w:type="dxa" w:w="100"/>
+              <w:right w:type="dxa" w:w="100"/>
+            </w:tcMar>
             <w:vAlign w:val="center"/>
           </w:tcPr>
           <w:p>
             <w:pPr>
-              <w:spacing w:after="80" w:before="120"/>
               <w:jc w:val="center"/>
             </w:pPr>
             <w:r>
@@ -1951,7 +1589,7 @@
                 <wp:inline distT="0" distB="0" distL="0" distR="0">
                   <wp:extent cx="857250" cy="1143000"/>
                   <wp:effectExtent t="0" r="0" b="0" l="0"/>
-                  <wp:docPr id="23" name="" descr="" title=""/>
+                  <wp:docPr id="21" name="" descr="" title=""/>
                   <wp:cNvGraphicFramePr>
                     <a:graphicFrameLocks xmlns:a="http://schemas.openxmlformats.org/drawingml/2006/main" noChangeAspect="1"/>
                   </wp:cNvGraphicFramePr>
@@ -1989,52 +1627,40 @@
           </w:p>
           <w:p>
             <w:pPr>
-              <w:bidi/>
-              <w:spacing w:after="20"/>
               <w:jc w:val="center"/>
             </w:pPr>
             <w:r>
               <w:rPr>
-                <w:rFonts w:ascii="Arial" w:cs="Arial" w:eastAsia="Arial" w:hAnsi="Arial"/>
                 <w:b/>
                 <w:bCs/>
-                <w:sz w:val="20"/>
-                <w:szCs w:val="20"/>
               </w:rPr>
               <w:t xml:space="preserve">תיק ספורט פולו</w:t>
             </w:r>
           </w:p>
           <w:p>
             <w:pPr>
-              <w:bidi/>
-              <w:spacing w:after="120"/>
-              <w:jc w:val="center"/>
-            </w:pPr>
-            <w:r>
-              <w:rPr>
-                <w:rFonts w:ascii="Arial" w:cs="Arial" w:eastAsia="Arial" w:hAnsi="Arial"/>
-                <w:color w:val="595959"/>
-                <w:sz w:val="18"/>
-                <w:szCs w:val="18"/>
-              </w:rPr>
+              <w:jc w:val="center"/>
+            </w:pPr>
+            <w:r>
               <w:t xml:space="preserve">כחול</w:t>
             </w:r>
           </w:p>
         </w:tc>
+      </w:tr>
+      <w:tr>
         <w:tc>
           <w:tcPr>
-            <w:tcW w:type="dxa" w:w="3402"/>
-            <w:tcBorders>
-              <w:top w:val="single" w:color="D9D9D9" w:sz="2"/>
-              <w:left w:val="single" w:color="D9D9D9" w:sz="2"/>
-              <w:bottom w:val="single" w:color="D9D9D9" w:sz="2"/>
-              <w:right w:val="single" w:color="D9D9D9" w:sz="2"/>
-            </w:tcBorders>
+            <w:tcW w:type="dxa" w:w="3000"/>
+            <w:tcMar>
+              <w:top w:type="dxa" w:w="100"/>
+              <w:left w:type="dxa" w:w="100"/>
+              <w:bottom w:type="dxa" w:w="100"/>
+              <w:right w:type="dxa" w:w="100"/>
+            </w:tcMar>
             <w:vAlign w:val="center"/>
           </w:tcPr>
           <w:p>
             <w:pPr>
-              <w:spacing w:after="80" w:before="120"/>
               <w:jc w:val="center"/>
             </w:pPr>
             <w:r>
@@ -2080,47 +1706,34 @@
           </w:p>
           <w:p>
             <w:pPr>
-              <w:bidi/>
-              <w:spacing w:after="20"/>
               <w:jc w:val="center"/>
             </w:pPr>
             <w:r>
               <w:rPr>
-                <w:rFonts w:ascii="Arial" w:cs="Arial" w:eastAsia="Arial" w:hAnsi="Arial"/>
                 <w:b/>
                 <w:bCs/>
-                <w:sz w:val="20"/>
-                <w:szCs w:val="20"/>
               </w:rPr>
               <w:t xml:space="preserve">תיק ספורט פולו</w:t>
             </w:r>
           </w:p>
           <w:p>
             <w:pPr>
-              <w:bidi/>
-              <w:spacing w:after="120"/>
-              <w:jc w:val="center"/>
-            </w:pPr>
-            <w:r>
-              <w:rPr>
-                <w:rFonts w:ascii="Arial" w:cs="Arial" w:eastAsia="Arial" w:hAnsi="Arial"/>
-                <w:color w:val="595959"/>
-                <w:sz w:val="18"/>
-                <w:szCs w:val="18"/>
-              </w:rPr>
+              <w:jc w:val="center"/>
+            </w:pPr>
+            <w:r>
               <w:t xml:space="preserve">שחור</w:t>
             </w:r>
           </w:p>
         </w:tc>
         <w:tc>
           <w:tcPr>
-            <w:tcW w:type="dxa" w:w="3402"/>
-            <w:tcBorders>
-              <w:top w:val="single" w:color="D9D9D9" w:sz="2"/>
-              <w:left w:val="single" w:color="D9D9D9" w:sz="2"/>
-              <w:bottom w:val="single" w:color="D9D9D9" w:sz="2"/>
-              <w:right w:val="single" w:color="D9D9D9" w:sz="2"/>
-            </w:tcBorders>
+            <w:tcW w:type="dxa" w:w="3000"/>
+          </w:tcPr>
+          <w:p/>
+        </w:tc>
+        <w:tc>
+          <w:tcPr>
+            <w:tcW w:type="dxa" w:w="3000"/>
           </w:tcPr>
           <w:p/>
         </w:tc>
@@ -2128,7 +1741,7 @@
     </w:tbl>
     <w:sectPr>
       <w:pgSz w:w="11906" w:h="16838" w:orient="portrait"/>
-      <w:pgMar w:top="850" w:right="850" w:bottom="850" w:left="850" w:header="708" w:footer="708" w:gutter="0"/>
+      <w:pgMar w:top="1440" w:right="1440" w:bottom="1440" w:left="1440" w:header="708" w:footer="708" w:gutter="0"/>
       <w:pgNumType/>
       <w:docGrid w:linePitch="360"/>
     </w:sectPr>

</xml_diff>